<commit_message>
Deploy preview for PR 118 🛫
</commit_message>
<xml_diff>
--- a/pr-preview/pr-118/chapters/05-interaction-tracked-changes.docx
+++ b/pr-preview/pr-118/chapters/05-interaction-tracked-changes.docx
@@ -269,7 +269,7 @@
               <w:t xml:space="preserve"> </w:t>
             </w:r>
             <w:r>
-              <w:t xml:space="preserve">sets two or more treatments at once.</w:t>
+              <w:t xml:space="preserve">fixes the values of several treatments simultaneously.</w:t>
             </w:r>
             <w:r>
               <w:t xml:space="preserve"> </w:t>
@@ -306,7 +306,7 @@
               <w:t xml:space="preserve"> </w:t>
             </w:r>
             <w:r>
-              <w:t xml:space="preserve">the</w:t>
+              <w:t xml:space="preserve">an individual’s</w:t>
             </w:r>
             <w:r>
               <w:t xml:space="preserve"> </w:t>
@@ -348,13 +348,7 @@
               <w:t xml:space="preserve"> </w:t>
             </w:r>
             <w:r>
-              <w:t xml:space="preserve">is the outcome that would have been observed</w:t>
-            </w:r>
-            <w:r>
-              <w:t xml:space="preserve"> </w:t>
-            </w:r>
-            <w:r>
-              <w:t xml:space="preserve">had we intervened to set</w:t>
+              <w:t xml:space="preserve">is their outcome in the hypothetical world where</w:t>
             </w:r>
             <w:r>
               <w:t xml:space="preserve"> </w:t>
@@ -368,7 +362,7 @@
               <w:t xml:space="preserve"> </w:t>
             </w:r>
             <w:r>
-              <w:t xml:space="preserve">to</w:t>
+              <w:t xml:space="preserve">is fixed at</w:t>
             </w:r>
             <w:r>
               <w:t xml:space="preserve"> </w:t>
@@ -396,7 +390,7 @@
               <w:t xml:space="preserve"> </w:t>
             </w:r>
             <w:r>
-              <w:t xml:space="preserve">to</w:t>
+              <w:t xml:space="preserve">at</w:t>
             </w:r>
             <w:r>
               <w:t xml:space="preserve"> </w:t>
@@ -1729,6 +1723,26 @@
               <w:t xml:space="preserve"> </w:t>
             </w:r>
             <w:r>
+              <w:t xml:space="preserve">Let</w:t>
+            </w:r>
+            <w:r>
+              <w:t xml:space="preserve"> </w:t>
+            </w:r>
+            <m:oMath>
+              <m:r>
+                <m:t>E</m:t>
+              </m:r>
+            </m:oMath>
+            <w:r>
+              <w:t xml:space="preserve"> </w:t>
+            </w:r>
+            <w:r>
+              <w:t xml:space="preserve">be a dichotomous treatment.</w:t>
+            </w:r>
+            <w:r>
+              <w:t xml:space="preserve"> </w:t>
+            </w:r>
+            <w:r>
               <w:t xml:space="preserve">Treatments</w:t>
             </w:r>
             <w:r>
@@ -1767,7 +1781,7 @@
               <w:t xml:space="preserve"> </w:t>
             </w:r>
             <w:r>
-              <w:t xml:space="preserve">in bringing about an outcome</w:t>
+              <w:t xml:space="preserve">for an outcome</w:t>
             </w:r>
             <w:r>
               <w:t xml:space="preserve"> </w:t>
@@ -1787,7 +1801,7 @@
               <w:t xml:space="preserve"> </w:t>
             </w:r>
             <w:r>
-              <w:t xml:space="preserve">the causal effect of</w:t>
+              <w:t xml:space="preserve">the effect of</w:t>
             </w:r>
             <w:r>
               <w:t xml:space="preserve"> </w:t>
@@ -1815,7 +1829,7 @@
               <w:t xml:space="preserve"> </w:t>
             </w:r>
             <w:r>
-              <w:t xml:space="preserve">under a joint intervention that sets</w:t>
+              <w:t xml:space="preserve">when we also fix</w:t>
             </w:r>
             <w:r>
               <w:t xml:space="preserve"> </w:t>
@@ -1829,13 +1843,13 @@
               <w:t xml:space="preserve"> </w:t>
             </w:r>
             <w:r>
-              <w:t xml:space="preserve">to 1</w:t>
-            </w:r>
-            <w:r>
-              <w:t xml:space="preserve"> </w:t>
-            </w:r>
-            <w:r>
-              <w:t xml:space="preserve">differs from the causal effect of</w:t>
+              <w:t xml:space="preserve">at 1</w:t>
+            </w:r>
+            <w:r>
+              <w:t xml:space="preserve"> </w:t>
+            </w:r>
+            <w:r>
+              <w:t xml:space="preserve">is not the same as the effect of</w:t>
             </w:r>
             <w:r>
               <w:t xml:space="preserve"> </w:t>
@@ -1863,7 +1877,7 @@
               <w:t xml:space="preserve"> </w:t>
             </w:r>
             <w:r>
-              <w:t xml:space="preserve">under a joint intervention that sets</w:t>
+              <w:t xml:space="preserve">when we also fix</w:t>
             </w:r>
             <w:r>
               <w:t xml:space="preserve"> </w:t>
@@ -1877,13 +1891,25 @@
               <w:t xml:space="preserve"> </w:t>
             </w:r>
             <w:r>
-              <w:t xml:space="preserve">to 0.</w:t>
-            </w:r>
-            <w:r>
-              <w:t xml:space="preserve"> </w:t>
-            </w:r>
-            <w:r>
-              <w:t xml:space="preserve">Whether, and how, the two effects differ depends on the effect measure used to compare them.</w:t>
+              <w:t xml:space="preserve">at 0.</w:t>
+            </w:r>
+            <w:r>
+              <w:t xml:space="preserve"> </w:t>
+            </w:r>
+            <w:r>
+              <w:t xml:space="preserve">The definition is completed by choosing an effect measure to compare the two effects,</w:t>
+            </w:r>
+            <w:r>
+              <w:t xml:space="preserve"> </w:t>
+            </w:r>
+            <w:r>
+              <w:t xml:space="preserve">such as the causal risk difference,</w:t>
+            </w:r>
+            <w:r>
+              <w:t xml:space="preserve"> </w:t>
+            </w:r>
+            <w:r>
+              <w:t xml:space="preserve">and whether, and how, the two effects differ can depend on that choice.</w:t>
             </w:r>
           </w:p>
           <w:bookmarkEnd w:id="15"/>
@@ -1997,7 +2023,7 @@
               <w:t xml:space="preserve"> </w:t>
             </w:r>
             <w:r>
-              <w:t xml:space="preserve">and whether you stand in the street dressed or naked (</w:t>
+              <w:t xml:space="preserve">and whether you are clothed or naked while you do it (</w:t>
             </w:r>
             <m:oMath>
               <m:r>
@@ -3209,7 +3235,43 @@
               <w:t xml:space="preserve"> </w:t>
             </w:r>
             <w:r>
-              <w:t xml:space="preserve">With</w:t>
+              <w:t xml:space="preserve">For dichotomous treatments</w:t>
+            </w:r>
+            <w:r>
+              <w:t xml:space="preserve"> </w:t>
+            </w:r>
+            <m:oMath>
+              <m:r>
+                <m:t>A</m:t>
+              </m:r>
+            </m:oMath>
+            <w:r>
+              <w:t xml:space="preserve">,</w:t>
+            </w:r>
+            <w:r>
+              <w:t xml:space="preserve"> </w:t>
+            </w:r>
+            <m:oMath>
+              <m:r>
+                <m:t>E</m:t>
+              </m:r>
+            </m:oMath>
+            <w:r>
+              <w:t xml:space="preserve"> </w:t>
+            </w:r>
+            <w:r>
+              <w:t xml:space="preserve">and outcome</w:t>
+            </w:r>
+            <w:r>
+              <w:t xml:space="preserve"> </w:t>
+            </w:r>
+            <m:oMath>
+              <m:r>
+                <m:t>Y</m:t>
+              </m:r>
+            </m:oMath>
+            <w:r>
+              <w:t xml:space="preserve">, with</w:t>
             </w:r>
             <w:r>
               <w:t xml:space="preserve"> </w:t>
@@ -3230,15 +3292,79 @@
                   </m:r>
                 </m:sub>
               </m:sSub>
-            </m:oMath>
-            <w:r>
-              <w:t xml:space="preserve"> </w:t>
-            </w:r>
-            <w:r>
-              <w:t xml:space="preserve">as in</w:t>
-            </w:r>
-            <w:r>
-              <w:t xml:space="preserve"> </w:t>
+              <m:limUpp>
+                <m:e>
+                  <m:r>
+                    <m:rPr>
+                      <m:sty m:val="p"/>
+                    </m:rPr>
+                    <m:t>=</m:t>
+                  </m:r>
+                </m:e>
+                <m:lim>
+                  <m:r>
+                    <m:rPr>
+                      <m:nor/>
+                      <m:sty m:val="p"/>
+                    </m:rPr>
+                    <m:t>def</m:t>
+                  </m:r>
+                </m:lim>
+              </m:limUpp>
+              <m:r>
+                <m:rPr>
+                  <m:sty m:val="p"/>
+                </m:rPr>
+                <m:t>Pr</m:t>
+              </m:r>
+              <m:r>
+                <m:rPr>
+                  <m:sty m:val="p"/>
+                </m:rPr>
+                <m:t>[</m:t>
+              </m:r>
+              <m:sSup>
+                <m:e>
+                  <m:r>
+                    <m:t>Y</m:t>
+                  </m:r>
+                </m:e>
+                <m:sup>
+                  <m:r>
+                    <m:t>a</m:t>
+                  </m:r>
+                  <m:r>
+                    <m:rPr>
+                      <m:sty m:val="p"/>
+                    </m:rPr>
+                    <m:t>,</m:t>
+                  </m:r>
+                  <m:r>
+                    <m:t>e</m:t>
+                  </m:r>
+                </m:sup>
+              </m:sSup>
+              <m:r>
+                <m:rPr>
+                  <m:sty m:val="p"/>
+                </m:rPr>
+                <m:t>=</m:t>
+              </m:r>
+              <m:r>
+                <m:t>1</m:t>
+              </m:r>
+              <m:r>
+                <m:rPr>
+                  <m:sty m:val="p"/>
+                </m:rPr>
+                <m:t>]</m:t>
+              </m:r>
+            </m:oMath>
+            <w:r>
+              <w:t xml:space="preserve"> </w:t>
+            </w:r>
+            <w:r>
+              <w:t xml:space="preserve">(</w:t>
             </w:r>
             <w:hyperlink w:anchor="def-interaction-additive">
               <w:r>
@@ -3249,7 +3375,7 @@
               </w:r>
             </w:hyperlink>
             <w:r>
-              <w:t xml:space="preserve">,</w:t>
+              <w:t xml:space="preserve">),</w:t>
             </w:r>
             <w:r>
               <w:t xml:space="preserve"> </w:t>
@@ -4590,7 +4716,43 @@
               <w:t xml:space="preserve"> </w:t>
             </w:r>
             <w:r>
-              <w:t xml:space="preserve">With</w:t>
+              <w:t xml:space="preserve">For dichotomous treatments</w:t>
+            </w:r>
+            <w:r>
+              <w:t xml:space="preserve"> </w:t>
+            </w:r>
+            <m:oMath>
+              <m:r>
+                <m:t>A</m:t>
+              </m:r>
+            </m:oMath>
+            <w:r>
+              <w:t xml:space="preserve">,</w:t>
+            </w:r>
+            <w:r>
+              <w:t xml:space="preserve"> </w:t>
+            </w:r>
+            <m:oMath>
+              <m:r>
+                <m:t>E</m:t>
+              </m:r>
+            </m:oMath>
+            <w:r>
+              <w:t xml:space="preserve"> </w:t>
+            </w:r>
+            <w:r>
+              <w:t xml:space="preserve">and outcome</w:t>
+            </w:r>
+            <w:r>
+              <w:t xml:space="preserve"> </w:t>
+            </w:r>
+            <m:oMath>
+              <m:r>
+                <m:t>Y</m:t>
+              </m:r>
+            </m:oMath>
+            <w:r>
+              <w:t xml:space="preserve">, with</w:t>
             </w:r>
             <w:r>
               <w:t xml:space="preserve"> </w:t>
@@ -4611,15 +4773,79 @@
                   </m:r>
                 </m:sub>
               </m:sSub>
-            </m:oMath>
-            <w:r>
-              <w:t xml:space="preserve"> </w:t>
-            </w:r>
-            <w:r>
-              <w:t xml:space="preserve">as in</w:t>
-            </w:r>
-            <w:r>
-              <w:t xml:space="preserve"> </w:t>
+              <m:limUpp>
+                <m:e>
+                  <m:r>
+                    <m:rPr>
+                      <m:sty m:val="p"/>
+                    </m:rPr>
+                    <m:t>=</m:t>
+                  </m:r>
+                </m:e>
+                <m:lim>
+                  <m:r>
+                    <m:rPr>
+                      <m:nor/>
+                      <m:sty m:val="p"/>
+                    </m:rPr>
+                    <m:t>def</m:t>
+                  </m:r>
+                </m:lim>
+              </m:limUpp>
+              <m:r>
+                <m:rPr>
+                  <m:sty m:val="p"/>
+                </m:rPr>
+                <m:t>Pr</m:t>
+              </m:r>
+              <m:r>
+                <m:rPr>
+                  <m:sty m:val="p"/>
+                </m:rPr>
+                <m:t>[</m:t>
+              </m:r>
+              <m:sSup>
+                <m:e>
+                  <m:r>
+                    <m:t>Y</m:t>
+                  </m:r>
+                </m:e>
+                <m:sup>
+                  <m:r>
+                    <m:t>a</m:t>
+                  </m:r>
+                  <m:r>
+                    <m:rPr>
+                      <m:sty m:val="p"/>
+                    </m:rPr>
+                    <m:t>,</m:t>
+                  </m:r>
+                  <m:r>
+                    <m:t>e</m:t>
+                  </m:r>
+                </m:sup>
+              </m:sSup>
+              <m:r>
+                <m:rPr>
+                  <m:sty m:val="p"/>
+                </m:rPr>
+                <m:t>=</m:t>
+              </m:r>
+              <m:r>
+                <m:t>1</m:t>
+              </m:r>
+              <m:r>
+                <m:rPr>
+                  <m:sty m:val="p"/>
+                </m:rPr>
+                <m:t>]</m:t>
+              </m:r>
+            </m:oMath>
+            <w:r>
+              <w:t xml:space="preserve"> </w:t>
+            </w:r>
+            <w:r>
+              <w:t xml:space="preserve">(</w:t>
             </w:r>
             <w:hyperlink w:anchor="def-interaction-additive">
               <w:r>
@@ -4630,7 +4856,7 @@
               </w:r>
             </w:hyperlink>
             <w:r>
-              <w:t xml:space="preserve">,</w:t>
+              <w:t xml:space="preserve">),</w:t>
             </w:r>
             <w:r>
               <w:t xml:space="preserve"> </w:t>
@@ -5433,7 +5659,43 @@
               <w:t xml:space="preserve"> </w:t>
             </w:r>
             <w:r>
-              <w:t xml:space="preserve">With</w:t>
+              <w:t xml:space="preserve">For dichotomous treatments</w:t>
+            </w:r>
+            <w:r>
+              <w:t xml:space="preserve"> </w:t>
+            </w:r>
+            <m:oMath>
+              <m:r>
+                <m:t>A</m:t>
+              </m:r>
+            </m:oMath>
+            <w:r>
+              <w:t xml:space="preserve">,</w:t>
+            </w:r>
+            <w:r>
+              <w:t xml:space="preserve"> </w:t>
+            </w:r>
+            <m:oMath>
+              <m:r>
+                <m:t>E</m:t>
+              </m:r>
+            </m:oMath>
+            <w:r>
+              <w:t xml:space="preserve"> </w:t>
+            </w:r>
+            <w:r>
+              <w:t xml:space="preserve">and outcome</w:t>
+            </w:r>
+            <w:r>
+              <w:t xml:space="preserve"> </w:t>
+            </w:r>
+            <m:oMath>
+              <m:r>
+                <m:t>Y</m:t>
+              </m:r>
+            </m:oMath>
+            <w:r>
+              <w:t xml:space="preserve">, with</w:t>
             </w:r>
             <w:r>
               <w:t xml:space="preserve"> </w:t>
@@ -5454,15 +5716,79 @@
                   </m:r>
                 </m:sub>
               </m:sSub>
-            </m:oMath>
-            <w:r>
-              <w:t xml:space="preserve"> </w:t>
-            </w:r>
-            <w:r>
-              <w:t xml:space="preserve">as in</w:t>
-            </w:r>
-            <w:r>
-              <w:t xml:space="preserve"> </w:t>
+              <m:limUpp>
+                <m:e>
+                  <m:r>
+                    <m:rPr>
+                      <m:sty m:val="p"/>
+                    </m:rPr>
+                    <m:t>=</m:t>
+                  </m:r>
+                </m:e>
+                <m:lim>
+                  <m:r>
+                    <m:rPr>
+                      <m:nor/>
+                      <m:sty m:val="p"/>
+                    </m:rPr>
+                    <m:t>def</m:t>
+                  </m:r>
+                </m:lim>
+              </m:limUpp>
+              <m:r>
+                <m:rPr>
+                  <m:sty m:val="p"/>
+                </m:rPr>
+                <m:t>Pr</m:t>
+              </m:r>
+              <m:r>
+                <m:rPr>
+                  <m:sty m:val="p"/>
+                </m:rPr>
+                <m:t>[</m:t>
+              </m:r>
+              <m:sSup>
+                <m:e>
+                  <m:r>
+                    <m:t>Y</m:t>
+                  </m:r>
+                </m:e>
+                <m:sup>
+                  <m:r>
+                    <m:t>a</m:t>
+                  </m:r>
+                  <m:r>
+                    <m:rPr>
+                      <m:sty m:val="p"/>
+                    </m:rPr>
+                    <m:t>,</m:t>
+                  </m:r>
+                  <m:r>
+                    <m:t>e</m:t>
+                  </m:r>
+                </m:sup>
+              </m:sSup>
+              <m:r>
+                <m:rPr>
+                  <m:sty m:val="p"/>
+                </m:rPr>
+                <m:t>=</m:t>
+              </m:r>
+              <m:r>
+                <m:t>1</m:t>
+              </m:r>
+              <m:r>
+                <m:rPr>
+                  <m:sty m:val="p"/>
+                </m:rPr>
+                <m:t>]</m:t>
+              </m:r>
+            </m:oMath>
+            <w:r>
+              <w:t xml:space="preserve"> </w:t>
+            </w:r>
+            <w:r>
+              <w:t xml:space="preserve">(</w:t>
             </w:r>
             <w:hyperlink w:anchor="def-interaction-additive">
               <w:r>
@@ -5473,7 +5799,7 @@
               </w:r>
             </w:hyperlink>
             <w:r>
-              <w:t xml:space="preserve">,</w:t>
+              <w:t xml:space="preserve">),</w:t>
             </w:r>
             <w:r>
               <w:t xml:space="preserve"> </w:t>
@@ -6273,7 +6599,43 @@
               <w:t xml:space="preserve"> </w:t>
             </w:r>
             <w:r>
-              <w:t xml:space="preserve">With</w:t>
+              <w:t xml:space="preserve">For dichotomous treatments</w:t>
+            </w:r>
+            <w:r>
+              <w:t xml:space="preserve"> </w:t>
+            </w:r>
+            <m:oMath>
+              <m:r>
+                <m:t>A</m:t>
+              </m:r>
+            </m:oMath>
+            <w:r>
+              <w:t xml:space="preserve">,</w:t>
+            </w:r>
+            <w:r>
+              <w:t xml:space="preserve"> </w:t>
+            </w:r>
+            <m:oMath>
+              <m:r>
+                <m:t>E</m:t>
+              </m:r>
+            </m:oMath>
+            <w:r>
+              <w:t xml:space="preserve"> </w:t>
+            </w:r>
+            <w:r>
+              <w:t xml:space="preserve">and outcome</w:t>
+            </w:r>
+            <w:r>
+              <w:t xml:space="preserve"> </w:t>
+            </w:r>
+            <m:oMath>
+              <m:r>
+                <m:t>Y</m:t>
+              </m:r>
+            </m:oMath>
+            <w:r>
+              <w:t xml:space="preserve">, with</w:t>
             </w:r>
             <w:r>
               <w:t xml:space="preserve"> </w:t>
@@ -6294,15 +6656,79 @@
                   </m:r>
                 </m:sub>
               </m:sSub>
-            </m:oMath>
-            <w:r>
-              <w:t xml:space="preserve"> </w:t>
-            </w:r>
-            <w:r>
-              <w:t xml:space="preserve">as in</w:t>
-            </w:r>
-            <w:r>
-              <w:t xml:space="preserve"> </w:t>
+              <m:limUpp>
+                <m:e>
+                  <m:r>
+                    <m:rPr>
+                      <m:sty m:val="p"/>
+                    </m:rPr>
+                    <m:t>=</m:t>
+                  </m:r>
+                </m:e>
+                <m:lim>
+                  <m:r>
+                    <m:rPr>
+                      <m:nor/>
+                      <m:sty m:val="p"/>
+                    </m:rPr>
+                    <m:t>def</m:t>
+                  </m:r>
+                </m:lim>
+              </m:limUpp>
+              <m:r>
+                <m:rPr>
+                  <m:sty m:val="p"/>
+                </m:rPr>
+                <m:t>Pr</m:t>
+              </m:r>
+              <m:r>
+                <m:rPr>
+                  <m:sty m:val="p"/>
+                </m:rPr>
+                <m:t>[</m:t>
+              </m:r>
+              <m:sSup>
+                <m:e>
+                  <m:r>
+                    <m:t>Y</m:t>
+                  </m:r>
+                </m:e>
+                <m:sup>
+                  <m:r>
+                    <m:t>a</m:t>
+                  </m:r>
+                  <m:r>
+                    <m:rPr>
+                      <m:sty m:val="p"/>
+                    </m:rPr>
+                    <m:t>,</m:t>
+                  </m:r>
+                  <m:r>
+                    <m:t>e</m:t>
+                  </m:r>
+                </m:sup>
+              </m:sSup>
+              <m:r>
+                <m:rPr>
+                  <m:sty m:val="p"/>
+                </m:rPr>
+                <m:t>=</m:t>
+              </m:r>
+              <m:r>
+                <m:t>1</m:t>
+              </m:r>
+              <m:r>
+                <m:rPr>
+                  <m:sty m:val="p"/>
+                </m:rPr>
+                <m:t>]</m:t>
+              </m:r>
+            </m:oMath>
+            <w:r>
+              <w:t xml:space="preserve"> </w:t>
+            </w:r>
+            <w:r>
+              <w:t xml:space="preserve">(</w:t>
             </w:r>
             <w:hyperlink w:anchor="def-interaction-additive">
               <w:r>
@@ -6313,10 +6739,7 @@
               </w:r>
             </w:hyperlink>
             <w:r>
-              <w:t xml:space="preserve"> </w:t>
-            </w:r>
-            <w:r>
-              <w:t xml:space="preserve">and</w:t>
+              <w:t xml:space="preserve">) and</w:t>
             </w:r>
             <w:r>
               <w:t xml:space="preserve"> </w:t>
@@ -10183,7 +10606,7 @@
               <w:t xml:space="preserve"> </w:t>
             </w:r>
             <w:r>
-              <w:t xml:space="preserve">Part III of the book shows that they are not necessary when the two treatments occur at different times</w:t>
+              <w:t xml:space="preserve">Part III of the book shows that they are not required once the two treatments are assigned at different times</w:t>
             </w:r>
             <w:r>
               <w:t xml:space="preserve"> </w:t>
@@ -12342,7 +12765,71 @@
               <w:t xml:space="preserve"> </w:t>
             </w:r>
             <w:r>
-              <w:t xml:space="preserve">but not for</w:t>
+              <w:t xml:space="preserve">within levels of</w:t>
+            </w:r>
+            <w:r>
+              <w:t xml:space="preserve"> </w:t>
+            </w:r>
+            <m:oMath>
+              <m:r>
+                <m:t>E</m:t>
+              </m:r>
+            </m:oMath>
+            <w:r>
+              <w:t xml:space="preserve"> </w:t>
+            </w:r>
+            <w:r>
+              <w:t xml:space="preserve">(</w:t>
+            </w:r>
+            <m:oMath>
+              <m:sSup>
+                <m:e>
+                  <m:r>
+                    <m:t>Y</m:t>
+                  </m:r>
+                </m:e>
+                <m:sup>
+                  <m:r>
+                    <m:t>a</m:t>
+                  </m:r>
+                </m:sup>
+              </m:sSup>
+              <m:r>
+                <m:rPr>
+                  <m:sty m:val="p"/>
+                </m:rPr>
+                <m:t>⟂</m:t>
+              </m:r>
+              <m:r>
+                <m:t>​</m:t>
+              </m:r>
+              <m:r>
+                <m:t>​</m:t>
+              </m:r>
+              <m:r>
+                <m:t>​</m:t>
+              </m:r>
+              <m:r>
+                <m:rPr>
+                  <m:sty m:val="p"/>
+                </m:rPr>
+                <m:t>⟂</m:t>
+              </m:r>
+              <m:r>
+                <m:t>A</m:t>
+              </m:r>
+              <m:r>
+                <m:rPr>
+                  <m:sty m:val="p"/>
+                </m:rPr>
+                <m:t>∣</m:t>
+              </m:r>
+              <m:r>
+                <m:t>E</m:t>
+              </m:r>
+            </m:oMath>
+            <w:r>
+              <w:t xml:space="preserve">, with positivity in each stratum) but no identifying assumptions for</w:t>
             </w:r>
             <w:r>
               <w:t xml:space="preserve"> </w:t>
@@ -12886,7 +13373,7 @@
       </w:ins>
       <w:ins w:id="47" w:author="PR Preview" w:date="2024-01-01T00:00:00Z">
         <w:r>
-          <w:t xml:space="preserve">is logically possible but probably rare,</w:t>
+          <w:t xml:space="preserve">can happen in principle but is presumably uncommon,</w:t>
         </w:r>
       </w:ins>
       <w:ins w:id="47" w:author="PR Preview" w:date="2024-01-01T00:00:00Z">
@@ -12896,7 +13383,7 @@
       </w:ins>
       <w:ins w:id="47" w:author="PR Preview" w:date="2024-01-01T00:00:00Z">
         <w:r>
-          <w:t xml:space="preserve">because it requires dual effects of</w:t>
+          <w:t xml:space="preserve">since it needs</w:t>
         </w:r>
       </w:ins>
       <w:ins w:id="47" w:author="PR Preview" w:date="2024-01-01T00:00:00Z">
@@ -12916,7 +13403,7 @@
       </w:ins>
       <w:ins w:id="47" w:author="PR Preview" w:date="2024-01-01T00:00:00Z">
         <w:r>
-          <w:t xml:space="preserve">and exact cancellations</w:t>
+          <w:t xml:space="preserve">to act in opposite directions with effects that cancel exactly</w:t>
         </w:r>
       </w:ins>
       <w:ins w:id="47" w:author="PR Preview" w:date="2024-01-01T00:00:00Z">
@@ -17327,7 +17814,7 @@
               </w:numPr>
             </w:pPr>
             <w:r>
-              <w:t xml:space="preserve">those who develop the outcome under only</w:t>
+              <w:t xml:space="preserve">outcome under exactly</w:t>
             </w:r>
             <w:r>
               <w:t xml:space="preserve"> </w:t>
@@ -17343,7 +17830,7 @@
               <w:t xml:space="preserve"> </w:t>
             </w:r>
             <w:r>
-              <w:t xml:space="preserve">of the four joint treatments: types 8, 12, 14, 15;</w:t>
+              <w:t xml:space="preserve">of the four joint interventions: types 8, 12, 14, 15;</w:t>
             </w:r>
           </w:p>
           <w:p>
@@ -17355,7 +17842,7 @@
               </w:numPr>
             </w:pPr>
             <w:r>
-              <w:t xml:space="preserve">those who develop the outcome under</w:t>
+              <w:t xml:space="preserve">outcome under exactly</w:t>
             </w:r>
             <w:r>
               <w:t xml:space="preserve"> </w:t>
@@ -17371,7 +17858,7 @@
               <w:t xml:space="preserve"> </w:t>
             </w:r>
             <w:r>
-              <w:t xml:space="preserve">joint treatments,</w:t>
+              <w:t xml:space="preserve">joint interventions,</w:t>
             </w:r>
             <w:r>
               <w:t xml:space="preserve"> </w:t>
@@ -17389,7 +17876,7 @@
               </w:numPr>
             </w:pPr>
             <w:r>
-              <w:t xml:space="preserve">those who develop the outcome under</w:t>
+              <w:t xml:space="preserve">outcome under exactly</w:t>
             </w:r>
             <w:r>
               <w:t xml:space="preserve"> </w:t>
@@ -17405,7 +17892,7 @@
               <w:t xml:space="preserve"> </w:t>
             </w:r>
             <w:r>
-              <w:t xml:space="preserve">of the four joint treatments: types 2, 3, 5, 9.</w:t>
+              <w:t xml:space="preserve">of them: types 2, 3, 5, 9.</w:t>
             </w:r>
           </w:p>
           <w:p>
@@ -17781,6 +18268,137 @@
             <m:oMath>
               <m:r>
                 <m:t>Y</m:t>
+              </m:r>
+            </m:oMath>
+            <w:r>
+              <w:t xml:space="preserve">,</w:t>
+            </w:r>
+            <w:r>
+              <w:t xml:space="preserve"> </w:t>
+            </w:r>
+            <w:r>
+              <w:t xml:space="preserve">let</w:t>
+            </w:r>
+            <w:r>
+              <w:t xml:space="preserve"> </w:t>
+            </w:r>
+            <m:oMath>
+              <m:sSub>
+                <m:e>
+                  <m:r>
+                    <m:t>p</m:t>
+                  </m:r>
+                </m:e>
+                <m:sub>
+                  <m:r>
+                    <m:t>a</m:t>
+                  </m:r>
+                  <m:r>
+                    <m:t>e</m:t>
+                  </m:r>
+                </m:sub>
+              </m:sSub>
+              <m:limUpp>
+                <m:e>
+                  <m:r>
+                    <m:rPr>
+                      <m:sty m:val="p"/>
+                    </m:rPr>
+                    <m:t>=</m:t>
+                  </m:r>
+                </m:e>
+                <m:lim>
+                  <m:r>
+                    <m:rPr>
+                      <m:nor/>
+                      <m:sty m:val="p"/>
+                    </m:rPr>
+                    <m:t>def</m:t>
+                  </m:r>
+                </m:lim>
+              </m:limUpp>
+              <m:r>
+                <m:rPr>
+                  <m:sty m:val="p"/>
+                </m:rPr>
+                <m:t>Pr</m:t>
+              </m:r>
+              <m:r>
+                <m:rPr>
+                  <m:sty m:val="p"/>
+                </m:rPr>
+                <m:t>[</m:t>
+              </m:r>
+              <m:sSup>
+                <m:e>
+                  <m:r>
+                    <m:t>Y</m:t>
+                  </m:r>
+                </m:e>
+                <m:sup>
+                  <m:r>
+                    <m:t>a</m:t>
+                  </m:r>
+                  <m:r>
+                    <m:rPr>
+                      <m:sty m:val="p"/>
+                    </m:rPr>
+                    <m:t>,</m:t>
+                  </m:r>
+                  <m:r>
+                    <m:t>e</m:t>
+                  </m:r>
+                </m:sup>
+              </m:sSup>
+              <m:r>
+                <m:rPr>
+                  <m:sty m:val="p"/>
+                </m:rPr>
+                <m:t>=</m:t>
+              </m:r>
+              <m:r>
+                <m:t>1</m:t>
+              </m:r>
+              <m:r>
+                <m:rPr>
+                  <m:sty m:val="p"/>
+                </m:rPr>
+                <m:t>]</m:t>
+              </m:r>
+            </m:oMath>
+            <w:r>
+              <w:t xml:space="preserve"> </w:t>
+            </w:r>
+            <w:r>
+              <w:t xml:space="preserve">be the population risk under the joint intervention</w:t>
+            </w:r>
+            <w:r>
+              <w:t xml:space="preserve"> </w:t>
+            </w:r>
+            <m:oMath>
+              <m:r>
+                <m:rPr>
+                  <m:sty m:val="p"/>
+                </m:rPr>
+                <m:t>(</m:t>
+              </m:r>
+              <m:r>
+                <m:t>a</m:t>
+              </m:r>
+              <m:r>
+                <m:rPr>
+                  <m:sty m:val="p"/>
+                </m:rPr>
+                <m:t>,</m:t>
+              </m:r>
+              <m:r>
+                <m:t>e</m:t>
+              </m:r>
+              <m:r>
+                <m:rPr>
+                  <m:sty m:val="p"/>
+                </m:rPr>
+                <m:t>)</m:t>
               </m:r>
             </m:oMath>
             <w:r>
@@ -20814,15 +21432,79 @@
                   </m:r>
                 </m:sub>
               </m:sSub>
-            </m:oMath>
-            <w:r>
-              <w:t xml:space="preserve"> </w:t>
-            </w:r>
-            <w:r>
-              <w:t xml:space="preserve">as in</w:t>
-            </w:r>
-            <w:r>
-              <w:t xml:space="preserve"> </w:t>
+              <m:limUpp>
+                <m:e>
+                  <m:r>
+                    <m:rPr>
+                      <m:sty m:val="p"/>
+                    </m:rPr>
+                    <m:t>=</m:t>
+                  </m:r>
+                </m:e>
+                <m:lim>
+                  <m:r>
+                    <m:rPr>
+                      <m:nor/>
+                      <m:sty m:val="p"/>
+                    </m:rPr>
+                    <m:t>def</m:t>
+                  </m:r>
+                </m:lim>
+              </m:limUpp>
+              <m:r>
+                <m:rPr>
+                  <m:sty m:val="p"/>
+                </m:rPr>
+                <m:t>Pr</m:t>
+              </m:r>
+              <m:r>
+                <m:rPr>
+                  <m:sty m:val="p"/>
+                </m:rPr>
+                <m:t>[</m:t>
+              </m:r>
+              <m:sSup>
+                <m:e>
+                  <m:r>
+                    <m:t>Y</m:t>
+                  </m:r>
+                </m:e>
+                <m:sup>
+                  <m:r>
+                    <m:t>a</m:t>
+                  </m:r>
+                  <m:r>
+                    <m:rPr>
+                      <m:sty m:val="p"/>
+                    </m:rPr>
+                    <m:t>,</m:t>
+                  </m:r>
+                  <m:r>
+                    <m:t>e</m:t>
+                  </m:r>
+                </m:sup>
+              </m:sSup>
+              <m:r>
+                <m:rPr>
+                  <m:sty m:val="p"/>
+                </m:rPr>
+                <m:t>=</m:t>
+              </m:r>
+              <m:r>
+                <m:t>1</m:t>
+              </m:r>
+              <m:r>
+                <m:rPr>
+                  <m:sty m:val="p"/>
+                </m:rPr>
+                <m:t>]</m:t>
+              </m:r>
+            </m:oMath>
+            <w:r>
+              <w:t xml:space="preserve"> </w:t>
+            </w:r>
+            <w:r>
+              <w:t xml:space="preserve">(</w:t>
             </w:r>
             <w:hyperlink w:anchor="def-interaction-additive">
               <w:r>
@@ -20833,7 +21515,7 @@
               </w:r>
             </w:hyperlink>
             <w:r>
-              <w:t xml:space="preserve">.</w:t>
+              <w:t xml:space="preserve">).</w:t>
             </w:r>
           </w:p>
           <w:p>
@@ -23481,7 +24163,7 @@
               <w:t xml:space="preserve"> </w:t>
             </w:r>
             <w:r>
-              <w:t xml:space="preserve">suppose a transplant kills only individuals who are allergic to anesthesia.</w:t>
+              <w:t xml:space="preserve">suppose the only way a transplant can cause death is through allergy to anesthesia.</w:t>
             </w:r>
             <w:r>
               <w:t xml:space="preserve"> </w:t>
@@ -23605,7 +24287,7 @@
               <w:t xml:space="preserve"> </w:t>
             </w:r>
             <w:r>
-              <w:t xml:space="preserve">of an outcome is a set of conditions,</w:t>
+              <w:t xml:space="preserve">of an outcome is a collection of conditions,</w:t>
             </w:r>
             <w:r>
               <w:t xml:space="preserve"> </w:t>
@@ -23617,7 +24299,7 @@
               <w:t xml:space="preserve"> </w:t>
             </w:r>
             <w:r>
-              <w:t xml:space="preserve">whose joint presence inevitably produces the outcome.</w:t>
+              <w:t xml:space="preserve">such that anyone meeting all of them develops the outcome.</w:t>
             </w:r>
             <w:r>
               <w:t xml:space="preserve"> </w:t>
@@ -23778,7 +24460,7 @@
               <w:t xml:space="preserve"> </w:t>
             </w:r>
             <w:r>
-              <w:t xml:space="preserve">Suppose also that not receiving a transplant kills only those with an ejection fraction below 20% (</w:t>
+              <w:t xml:space="preserve">Suppose also that the only way going without a transplant can cause death is through an ejection fraction below 20% (</w:t>
             </w:r>
             <m:oMath>
               <m:sSub>
@@ -23810,7 +24492,7 @@
               <w:t xml:space="preserve"> </w:t>
             </w:r>
             <w:r>
-              <w:t xml:space="preserve">and that pancreatic cancer at study start (</w:t>
+              <w:t xml:space="preserve">and that, apart from these two routes, the only cause of death is pancreatic cancer at study start (</w:t>
             </w:r>
             <m:oMath>
               <m:sSub>
@@ -23836,7 +24518,7 @@
               </m:r>
             </m:oMath>
             <w:r>
-              <w:t xml:space="preserve">) kills whatever the treatment.</w:t>
+              <w:t xml:space="preserve">), which kills whatever the treatment.</w:t>
             </w:r>
             <w:r>
               <w:t xml:space="preserve"> </w:t>
@@ -27977,19 +28659,19 @@
               <w:t xml:space="preserve"> </w:t>
             </w:r>
             <w:r>
-              <w:t xml:space="preserve">are absent.</w:t>
-            </w:r>
-            <w:r>
-              <w:t xml:space="preserve"> </w:t>
-            </w:r>
-            <w:r>
-              <w:t xml:space="preserve">If they were present,</w:t>
-            </w:r>
-            <w:r>
-              <w:t xml:space="preserve"> </w:t>
-            </w:r>
-            <w:r>
-              <w:t xml:space="preserve">some individuals (e.g., those with</w:t>
+              <w:t xml:space="preserve">are absent,</w:t>
+            </w:r>
+            <w:r>
+              <w:t xml:space="preserve"> </w:t>
+            </w:r>
+            <w:r>
+              <w:t xml:space="preserve">in the sense that none of them is ever anyone’s only route to death.</w:t>
+            </w:r>
+            <w:r>
+              <w:t xml:space="preserve"> </w:t>
+            </w:r>
+            <w:r>
+              <w:t xml:space="preserve">If one were, the individuals completing it (e.g., those whose only background factor is</w:t>
             </w:r>
             <w:r>
               <w:t xml:space="preserve"> </w:t>
@@ -28018,7 +28700,13 @@
               </m:r>
             </m:oMath>
             <w:r>
-              <w:t xml:space="preserve">) would be killed by vitamins,</w:t>
+              <w:t xml:space="preserve">)</w:t>
+            </w:r>
+            <w:r>
+              <w:t xml:space="preserve"> </w:t>
+            </w:r>
+            <w:r>
+              <w:t xml:space="preserve">would be killed by vitamins,</w:t>
             </w:r>
             <w:r>
               <w:t xml:space="preserve"> </w:t>
@@ -30933,7 +31621,7 @@
               <w:t xml:space="preserve"> </w:t>
             </w:r>
             <w:r>
-              <w:t xml:space="preserve">indicate a deleterious mutation in each of the two alleles of a gene that produces an essential protein</w:t>
+              <w:t xml:space="preserve">indicate a harmful mutation in each of the two copies of a gene needed to make a vital protein</w:t>
             </w:r>
             <w:r>
               <w:t xml:space="preserve"> </w:t>
@@ -31049,7 +31737,7 @@
               <w:t xml:space="preserve"> </w:t>
             </w:r>
             <w:r>
-              <w:t xml:space="preserve">yet the alleles arguably do not physically act on each other.</w:t>
+              <w:t xml:space="preserve">yet the two copies need not act on each other in any physical sense.</w:t>
             </w:r>
           </w:p>
           <w:bookmarkEnd w:id="110"/>
@@ -31308,17 +31996,7 @@
       </w:pPr>
       <w:ins w:id="117" w:author="PR Preview" w:date="2024-01-01T00:00:00Z">
         <w:r>
-          <w:t xml:space="preserve">The sufficient-component-cause model starts from an outcome and looks for the events that could have produced it;</w:t>
-        </w:r>
-      </w:ins>
-      <w:ins w:id="117" w:author="PR Preview" w:date="2024-01-01T00:00:00Z">
-        <w:r>
-          <w:t xml:space="preserve"> </w:t>
-        </w:r>
-      </w:ins>
-      <w:ins w:id="117" w:author="PR Preview" w:date="2024-01-01T00:00:00Z">
-        <w:r>
-          <w:t xml:space="preserve">the counterfactual model starts from one factor and looks at what changing that factor would do to the outcome</w:t>
+          <w:t xml:space="preserve">The two models look in opposite directions</w:t>
         </w:r>
       </w:ins>
       <w:ins w:id="117" w:author="PR Preview" w:date="2024-01-01T00:00:00Z">
@@ -31333,7 +32011,27 @@
       </w:ins>
       <w:ins w:id="117" w:author="PR Preview" w:date="2024-01-01T00:00:00Z">
         <w:r>
-          <w:t xml:space="preserve">.</w:t>
+          <w:t xml:space="preserve">:</w:t>
+        </w:r>
+      </w:ins>
+      <w:ins w:id="117" w:author="PR Preview" w:date="2024-01-01T00:00:00Z">
+        <w:r>
+          <w:t xml:space="preserve"> </w:t>
+        </w:r>
+      </w:ins>
+      <w:ins w:id="117" w:author="PR Preview" w:date="2024-01-01T00:00:00Z">
+        <w:r>
+          <w:t xml:space="preserve">sufficient-component causes trace an effect back to its possible causes,</w:t>
+        </w:r>
+      </w:ins>
+      <w:ins w:id="117" w:author="PR Preview" w:date="2024-01-01T00:00:00Z">
+        <w:r>
+          <w:t xml:space="preserve"> </w:t>
+        </w:r>
+      </w:ins>
+      <w:ins w:id="117" w:author="PR Preview" w:date="2024-01-01T00:00:00Z">
+        <w:r>
+          <w:t xml:space="preserve">and counterfactuals trace a cause forward to its possible effects.</w:t>
         </w:r>
       </w:ins>
       <w:ins w:id="117" w:author="PR Preview" w:date="2024-01-01T00:00:00Z">
@@ -31508,7 +32206,7 @@
       </w:ins>
       <w:ins w:id="117" w:author="PR Preview" w:date="2024-01-01T00:00:00Z">
         <w:r>
-          <w:t xml:space="preserve">A counterfactual framework of causation was already hinted at by Hume (1748).</w:t>
+          <w:t xml:space="preserve">Hume (1748) already anticipated a counterfactual account of causation.</w:t>
         </w:r>
       </w:ins>
     </w:p>
@@ -32115,13 +32813,13 @@
               <w:t xml:space="preserve"> </w:t>
             </w:r>
             <w:r>
-              <w:t xml:space="preserve">Had either treatment been withheld, he would not have been a case.</w:t>
-            </w:r>
-            <w:r>
-              <w:t xml:space="preserve"> </w:t>
-            </w:r>
-            <w:r>
-              <w:t xml:space="preserve">So Zeus is among the cases prevented by setting</w:t>
+              <w:t xml:space="preserve">Withholding either treatment alone would have averted his death.</w:t>
+            </w:r>
+            <w:r>
+              <w:t xml:space="preserve"> </w:t>
+            </w:r>
+            <w:r>
+              <w:t xml:space="preserve">He therefore belongs both to the cases averted by setting</w:t>
             </w:r>
             <w:r>
               <w:t xml:space="preserve"> </w:t>
@@ -32161,7 +32859,7 @@
               <w:t xml:space="preserve"> </w:t>
             </w:r>
             <w:r>
-              <w:t xml:space="preserve">and among those prevented by setting</w:t>
+              <w:t xml:space="preserve">and to those averted by setting</w:t>
             </w:r>
             <w:r>
               <w:t xml:space="preserve"> </w:t>
@@ -32274,7 +32972,7 @@
               <w:t xml:space="preserve"> </w:t>
             </w:r>
             <w:r>
-              <w:t xml:space="preserve">Intellectual disability due to phenylketonuria occurs in genetically susceptible individuals who eat certain foods.</w:t>
+              <w:t xml:space="preserve">Intellectual disability due to phenylketonuria occurs only in people who carry a genetic susceptibility and whose diet includes certain foods.</w:t>
             </w:r>
             <w:r>
               <w:t xml:space="preserve"> </w:t>
@@ -32755,7 +33453,7 @@
               <w:t xml:space="preserve"> </w:t>
             </w:r>
             <w:r>
-              <w:t xml:space="preserve">So under monotonicity, a sufficient cause containing</w:t>
+              <w:t xml:space="preserve">So under monotonicity, whoever completes a sufficient cause containing</w:t>
             </w:r>
             <w:r>
               <w:t xml:space="preserve"> </w:t>
@@ -32778,13 +33476,98 @@
               <w:t xml:space="preserve"> </w:t>
             </w:r>
             <w:r>
-              <w:t xml:space="preserve">never makes the difference to anyone’s outcome,</w:t>
-            </w:r>
-            <w:r>
-              <w:t xml:space="preserve"> </w:t>
-            </w:r>
-            <w:r>
-              <w:t xml:space="preserve">and the same argument applies to</w:t>
+              <w:t xml:space="preserve">under</w:t>
+            </w:r>
+            <w:r>
+              <w:t xml:space="preserve"> </w:t>
+            </w:r>
+            <m:oMath>
+              <m:r>
+                <m:rPr>
+                  <m:sty m:val="p"/>
+                </m:rPr>
+                <m:t>(</m:t>
+              </m:r>
+              <m:r>
+                <m:t>a</m:t>
+              </m:r>
+              <m:r>
+                <m:rPr>
+                  <m:sty m:val="p"/>
+                </m:rPr>
+                <m:t>=</m:t>
+              </m:r>
+              <m:r>
+                <m:t>0</m:t>
+              </m:r>
+              <m:r>
+                <m:rPr>
+                  <m:sty m:val="p"/>
+                </m:rPr>
+                <m:t>,</m:t>
+              </m:r>
+              <m:r>
+                <m:t>e</m:t>
+              </m:r>
+              <m:r>
+                <m:rPr>
+                  <m:sty m:val="p"/>
+                </m:rPr>
+                <m:t>)</m:t>
+              </m:r>
+            </m:oMath>
+            <w:r>
+              <w:t xml:space="preserve"> </w:t>
+            </w:r>
+            <w:r>
+              <w:t xml:space="preserve">also develops the outcome under</w:t>
+            </w:r>
+            <w:r>
+              <w:t xml:space="preserve"> </w:t>
+            </w:r>
+            <m:oMath>
+              <m:r>
+                <m:rPr>
+                  <m:sty m:val="p"/>
+                </m:rPr>
+                <m:t>(</m:t>
+              </m:r>
+              <m:r>
+                <m:t>a</m:t>
+              </m:r>
+              <m:r>
+                <m:rPr>
+                  <m:sty m:val="p"/>
+                </m:rPr>
+                <m:t>=</m:t>
+              </m:r>
+              <m:r>
+                <m:t>1</m:t>
+              </m:r>
+              <m:r>
+                <m:rPr>
+                  <m:sty m:val="p"/>
+                </m:rPr>
+                <m:t>,</m:t>
+              </m:r>
+              <m:r>
+                <m:t>e</m:t>
+              </m:r>
+              <m:r>
+                <m:rPr>
+                  <m:sty m:val="p"/>
+                </m:rPr>
+                <m:t>)</m:t>
+              </m:r>
+            </m:oMath>
+            <w:r>
+              <w:t xml:space="preserve">, through some other sufficient cause.</w:t>
+            </w:r>
+            <w:r>
+              <w:t xml:space="preserve"> </w:t>
+            </w:r>
+            <w:r>
+              <w:t xml:space="preserve">The same argument applies to</w:t>
             </w:r>
             <w:r>
               <w:t xml:space="preserve"> </w:t>
@@ -32810,7 +33593,7 @@
               <w:t xml:space="preserve"> </w:t>
             </w:r>
             <w:r>
-              <w:t xml:space="preserve">In this sense, monotonicity rules out the sufficient causes that contain</w:t>
+              <w:t xml:space="preserve">Monotonicity therefore rules out every sufficient cause containing</w:t>
             </w:r>
             <w:r>
               <w:t xml:space="preserve"> </w:t>
@@ -32853,7 +33636,16 @@
               </m:r>
             </m:oMath>
             <w:r>
-              <w:t xml:space="preserve">.</w:t>
+              <w:t xml:space="preserve"> </w:t>
+            </w:r>
+            <w:r>
+              <w:t xml:space="preserve">that would leave some individual’s outcome preventable by treatment;</w:t>
+            </w:r>
+            <w:r>
+              <w:t xml:space="preserve"> </w:t>
+            </w:r>
+            <w:r>
+              <w:t xml:space="preserve">this is the sense in which such causes cannot be present.</w:t>
             </w:r>
           </w:p>
           <w:bookmarkEnd w:id="120"/>
@@ -33442,22 +34234,25 @@
           <w:numId w:val="1019"/>
         </w:numPr>
       </w:pPr>
-      <w:r>
-        <w:rPr>
-          <w:b/>
-          <w:bCs/>
-        </w:rPr>
-        <w:t xml:space="preserve">Identification</w:t>
-      </w:r>
-      <w:r>
-        <w:t xml:space="preserve"> </w:t>
-      </w:r>
-      <w:r>
-        <w:t xml:space="preserve">requires exchangeability, positivity, and consistency for the joint treatment</w:t>
-      </w:r>
-      <w:r>
-        <w:t xml:space="preserve"> </w:t>
-      </w:r>
+      <w:ins w:id="131" w:author="PR Preview" w:date="2024-01-01T00:00:00Z">
+        <w:r>
+          <w:rPr>
+            <w:b/>
+            <w:bCs/>
+          </w:rPr>
+          <w:t xml:space="preserve">Identification</w:t>
+        </w:r>
+      </w:ins>
+      <w:ins w:id="131" w:author="PR Preview" w:date="2024-01-01T00:00:00Z">
+        <w:r>
+          <w:t xml:space="preserve">: exchangeability, positivity, and consistency for the joint treatment</w:t>
+        </w:r>
+      </w:ins>
+      <w:ins w:id="131" w:author="PR Preview" w:date="2024-01-01T00:00:00Z">
+        <w:r>
+          <w:t xml:space="preserve"> </w:t>
+        </w:r>
+      </w:ins>
       <m:oMath>
         <m:r>
           <m:rPr>
@@ -33484,40 +34279,61 @@
           <m:t>)</m:t>
         </m:r>
       </m:oMath>
-      <w:r>
-        <w:t xml:space="preserve">;</w:t>
-      </w:r>
-      <w:r>
-        <w:t xml:space="preserve"> </w:t>
-      </w:r>
-      <w:r>
-        <w:t xml:space="preserve">if</w:t>
-      </w:r>
-      <w:r>
-        <w:t xml:space="preserve"> </w:t>
-      </w:r>
+      <w:ins w:id="131" w:author="PR Preview" w:date="2024-01-01T00:00:00Z">
+        <w:r>
+          <w:t xml:space="preserve"> </w:t>
+        </w:r>
+      </w:ins>
+      <w:ins w:id="131" w:author="PR Preview" w:date="2024-01-01T00:00:00Z">
+        <w:r>
+          <w:t xml:space="preserve">suffice;</w:t>
+        </w:r>
+      </w:ins>
+      <w:ins w:id="131" w:author="PR Preview" w:date="2024-01-01T00:00:00Z">
+        <w:r>
+          <w:t xml:space="preserve"> </w:t>
+        </w:r>
+      </w:ins>
+      <w:ins w:id="131" w:author="PR Preview" w:date="2024-01-01T00:00:00Z">
+        <w:r>
+          <w:t xml:space="preserve">if</w:t>
+        </w:r>
+      </w:ins>
+      <w:ins w:id="131" w:author="PR Preview" w:date="2024-01-01T00:00:00Z">
+        <w:r>
+          <w:t xml:space="preserve"> </w:t>
+        </w:r>
+      </w:ins>
       <m:oMath>
         <m:r>
           <m:t>E</m:t>
         </m:r>
       </m:oMath>
-      <w:r>
-        <w:t xml:space="preserve"> </w:t>
-      </w:r>
-      <w:r>
-        <w:t xml:space="preserve">is randomized, interaction coincides with effect modification by</w:t>
-      </w:r>
-      <w:r>
-        <w:t xml:space="preserve"> </w:t>
-      </w:r>
+      <w:ins w:id="131" w:author="PR Preview" w:date="2024-01-01T00:00:00Z">
+        <w:r>
+          <w:t xml:space="preserve"> </w:t>
+        </w:r>
+      </w:ins>
+      <w:ins w:id="131" w:author="PR Preview" w:date="2024-01-01T00:00:00Z">
+        <w:r>
+          <w:t xml:space="preserve">is randomized, interaction coincides with effect modification by</w:t>
+        </w:r>
+      </w:ins>
+      <w:ins w:id="131" w:author="PR Preview" w:date="2024-01-01T00:00:00Z">
+        <w:r>
+          <w:t xml:space="preserve"> </w:t>
+        </w:r>
+      </w:ins>
       <m:oMath>
         <m:r>
           <m:t>E</m:t>
         </m:r>
       </m:oMath>
-      <w:r>
-        <w:t xml:space="preserve">.</w:t>
-      </w:r>
+      <w:ins w:id="131" w:author="PR Preview" w:date="2024-01-01T00:00:00Z">
+        <w:r>
+          <w:t xml:space="preserve">.</w:t>
+        </w:r>
+      </w:ins>
     </w:p>
     <w:p>
       <w:pPr>
@@ -33636,7 +34452,20 @@
       </w:ins>
       <w:ins w:id="134" w:author="PR Preview" w:date="2024-01-01T00:00:00Z">
         <w:r>
-          <w:t xml:space="preserve">appear in the same sufficient cause;</w:t>
+          <w:t xml:space="preserve">appear in the same sufficient cause that someone in the population can complete (</w:t>
+        </w:r>
+      </w:ins>
+      <w:hyperlink w:anchor="def-sufficient-cause-interaction">
+        <w:r>
+          <w:rPr>
+            <w:rStyle w:val="Hyperlink"/>
+          </w:rPr>
+          <w:t xml:space="preserve">Definition 12</w:t>
+        </w:r>
+      </w:hyperlink>
+      <w:ins w:id="134" w:author="PR Preview" w:date="2024-01-01T00:00:00Z">
+        <w:r>
+          <w:t xml:space="preserve">);</w:t>
         </w:r>
       </w:ins>
       <w:ins w:id="134" w:author="PR Preview" w:date="2024-01-01T00:00:00Z">

</xml_diff>